<commit_message>
Talk doc addendum: no GPU is energy-proportional (B200 534->709 W for 36x throughput); B200 KV independently confirmed (1.26x)
Co-Authored-By: Claude Opus 5.5 (1M context) <noreply@anthropic.com>
</commit_message>
<xml_diff>
--- a/GPU_power/ENERGY_FINDINGS_2026-10-22.docx
+++ b/GPU_power/ENERGY_FINDINGS_2026-10-22.docx
@@ -4319,13 +4319,332 @@
           <w:b/>
           <w:i w:val="0"/>
         </w:rPr>
-        <w:t>Power-capped GPUs are not energy-proportional.</w:t>
+        <w:t>No GPU we measured is energy-proportional.</w:t>
       </w:r>
       <w:r>
         <w:rPr>
           <w:i w:val="0"/>
         </w:rPr>
-        <w:t xml:space="preserve"> Under realistic open-loop (Poisson) arrivals, the A100 draws 279–298 W whether it serves 1 or 24 requests per second, and the A6000 293–299 W from 0.5 to 12 req/s.</w:t>
+        <w:t xml:space="preserve"> Under realistic open-loop (Poisson) arrivals, power barely tracks load:</w:t>
+      </w:r>
+    </w:p>
+    <w:tbl>
+      <w:tblPr>
+        <w:tblStyle w:val="LightGrid-Accent1"/>
+        <w:tblW w:type="auto" w:w="0"/>
+        <w:tblLook w:firstColumn="1" w:firstRow="1" w:lastColumn="0" w:lastRow="0" w:noHBand="0" w:noVBand="1" w:val="04A0"/>
+      </w:tblPr>
+      <w:tblGrid>
+        <w:gridCol w:w="1728"/>
+        <w:gridCol w:w="1728"/>
+        <w:gridCol w:w="1728"/>
+        <w:gridCol w:w="1728"/>
+        <w:gridCol w:w="1728"/>
+      </w:tblGrid>
+      <w:tr>
+        <w:tc>
+          <w:tcPr>
+            <w:tcW w:type="dxa" w:w="1728"/>
+          </w:tcPr>
+          <w:p>
+            <w:r/>
+            <w:r>
+              <w:rPr>
+                <w:b/>
+                <w:i w:val="0"/>
+              </w:rPr>
+              <w:t>Qwen2-7B, Poisson arrivals</w:t>
+            </w:r>
+          </w:p>
+        </w:tc>
+        <w:tc>
+          <w:tcPr>
+            <w:tcW w:type="dxa" w:w="1728"/>
+          </w:tcPr>
+          <w:p>
+            <w:r/>
+            <w:r>
+              <w:rPr>
+                <w:b/>
+                <w:i w:val="0"/>
+              </w:rPr>
+              <w:t>Power at the lowest rate</w:t>
+            </w:r>
+          </w:p>
+        </w:tc>
+        <w:tc>
+          <w:tcPr>
+            <w:tcW w:type="dxa" w:w="1728"/>
+          </w:tcPr>
+          <w:p>
+            <w:r/>
+            <w:r>
+              <w:rPr>
+                <w:b/>
+                <w:i w:val="0"/>
+              </w:rPr>
+              <w:t>Power at the highest rate</w:t>
+            </w:r>
+          </w:p>
+        </w:tc>
+        <w:tc>
+          <w:tcPr>
+            <w:tcW w:type="dxa" w:w="1728"/>
+          </w:tcPr>
+          <w:p>
+            <w:r/>
+            <w:r>
+              <w:rPr>
+                <w:b/>
+                <w:i w:val="0"/>
+              </w:rPr>
+              <w:t>Throughput increase</w:t>
+            </w:r>
+          </w:p>
+        </w:tc>
+        <w:tc>
+          <w:tcPr>
+            <w:tcW w:type="dxa" w:w="1728"/>
+          </w:tcPr>
+          <w:p>
+            <w:r/>
+            <w:r>
+              <w:rPr>
+                <w:b/>
+                <w:i w:val="0"/>
+              </w:rPr>
+              <w:t>Energy per token, lowest → highest rate</w:t>
+            </w:r>
+          </w:p>
+        </w:tc>
+      </w:tr>
+      <w:tr>
+        <w:tc>
+          <w:tcPr>
+            <w:tcW w:type="dxa" w:w="1728"/>
+          </w:tcPr>
+          <w:p>
+            <w:r/>
+            <w:r>
+              <w:rPr>
+                <w:i w:val="0"/>
+              </w:rPr>
+              <w:t>B200 (not capped), 2 → 64 req/s</w:t>
+            </w:r>
+          </w:p>
+        </w:tc>
+        <w:tc>
+          <w:tcPr>
+            <w:tcW w:type="dxa" w:w="1728"/>
+          </w:tcPr>
+          <w:p>
+            <w:r/>
+            <w:r>
+              <w:rPr>
+                <w:i w:val="0"/>
+              </w:rPr>
+              <w:t>534 W (53% of limit)</w:t>
+            </w:r>
+          </w:p>
+        </w:tc>
+        <w:tc>
+          <w:tcPr>
+            <w:tcW w:type="dxa" w:w="1728"/>
+          </w:tcPr>
+          <w:p>
+            <w:r/>
+            <w:r>
+              <w:rPr>
+                <w:i w:val="0"/>
+              </w:rPr>
+              <w:t>709 W (71%)</w:t>
+            </w:r>
+          </w:p>
+        </w:tc>
+        <w:tc>
+          <w:tcPr>
+            <w:tcW w:type="dxa" w:w="1728"/>
+          </w:tcPr>
+          <w:p>
+            <w:r/>
+            <w:r>
+              <w:rPr>
+                <w:i w:val="0"/>
+              </w:rPr>
+              <w:t>36×</w:t>
+            </w:r>
+          </w:p>
+        </w:tc>
+        <w:tc>
+          <w:tcPr>
+            <w:tcW w:type="dxa" w:w="1728"/>
+          </w:tcPr>
+          <w:p>
+            <w:r/>
+            <w:r>
+              <w:rPr>
+                <w:i w:val="0"/>
+              </w:rPr>
+              <w:t>2.18 → 0.081 J</w:t>
+            </w:r>
+          </w:p>
+        </w:tc>
+      </w:tr>
+      <w:tr>
+        <w:tc>
+          <w:tcPr>
+            <w:tcW w:type="dxa" w:w="1728"/>
+          </w:tcPr>
+          <w:p>
+            <w:r/>
+            <w:r>
+              <w:rPr>
+                <w:i w:val="0"/>
+              </w:rPr>
+              <w:t>A100 (capped), 1 → 24 req/s</w:t>
+            </w:r>
+          </w:p>
+        </w:tc>
+        <w:tc>
+          <w:tcPr>
+            <w:tcW w:type="dxa" w:w="1728"/>
+          </w:tcPr>
+          <w:p>
+            <w:r/>
+            <w:r>
+              <w:rPr>
+                <w:i w:val="0"/>
+              </w:rPr>
+              <w:t>279 W</w:t>
+            </w:r>
+          </w:p>
+        </w:tc>
+        <w:tc>
+          <w:tcPr>
+            <w:tcW w:type="dxa" w:w="1728"/>
+          </w:tcPr>
+          <w:p>
+            <w:r/>
+            <w:r>
+              <w:rPr>
+                <w:i w:val="0"/>
+              </w:rPr>
+              <w:t>298 W</w:t>
+            </w:r>
+          </w:p>
+        </w:tc>
+        <w:tc>
+          <w:tcPr>
+            <w:tcW w:type="dxa" w:w="1728"/>
+          </w:tcPr>
+          <w:p>
+            <w:r/>
+            <w:r>
+              <w:rPr>
+                <w:i w:val="0"/>
+              </w:rPr>
+              <w:t>25×</w:t>
+            </w:r>
+          </w:p>
+        </w:tc>
+        <w:tc>
+          <w:tcPr>
+            <w:tcW w:type="dxa" w:w="1728"/>
+          </w:tcPr>
+          <w:p>
+            <w:r/>
+            <w:r>
+              <w:rPr>
+                <w:i w:val="0"/>
+              </w:rPr>
+              <w:t>2.04 → 0.086 J</w:t>
+            </w:r>
+          </w:p>
+        </w:tc>
+      </w:tr>
+      <w:tr>
+        <w:tc>
+          <w:tcPr>
+            <w:tcW w:type="dxa" w:w="1728"/>
+          </w:tcPr>
+          <w:p>
+            <w:r/>
+            <w:r>
+              <w:rPr>
+                <w:i w:val="0"/>
+              </w:rPr>
+              <w:t>A6000 (capped), 0.5 → 12 req/s</w:t>
+            </w:r>
+          </w:p>
+        </w:tc>
+        <w:tc>
+          <w:tcPr>
+            <w:tcW w:type="dxa" w:w="1728"/>
+          </w:tcPr>
+          <w:p>
+            <w:r/>
+            <w:r>
+              <w:rPr>
+                <w:i w:val="0"/>
+              </w:rPr>
+              <w:t>293 W</w:t>
+            </w:r>
+          </w:p>
+        </w:tc>
+        <w:tc>
+          <w:tcPr>
+            <w:tcW w:type="dxa" w:w="1728"/>
+          </w:tcPr>
+          <w:p>
+            <w:r/>
+            <w:r>
+              <w:rPr>
+                <w:i w:val="0"/>
+              </w:rPr>
+              <w:t>299 W</w:t>
+            </w:r>
+          </w:p>
+        </w:tc>
+        <w:tc>
+          <w:tcPr>
+            <w:tcW w:type="dxa" w:w="1728"/>
+          </w:tcPr>
+          <w:p>
+            <w:r/>
+            <w:r>
+              <w:rPr>
+                <w:i w:val="0"/>
+              </w:rPr>
+              <w:t>15×</w:t>
+            </w:r>
+          </w:p>
+        </w:tc>
+        <w:tc>
+          <w:tcPr>
+            <w:tcW w:type="dxa" w:w="1728"/>
+          </w:tcPr>
+          <w:p>
+            <w:r/>
+            <w:r>
+              <w:rPr>
+                <w:i w:val="0"/>
+              </w:rPr>
+              <w:t>2.80 → 0.187 J</w:t>
+            </w:r>
+          </w:p>
+        </w:tc>
+      </w:tr>
+    </w:tbl>
+    <w:p/>
+    <w:p>
+      <w:pPr>
+        <w:pStyle w:val="ListBullet2"/>
+      </w:pPr>
+      <w:r>
+        <w:rPr>
+          <w:i w:val="0"/>
+        </w:rPr>
+        <w:t>Energy per token is therefore set almost entirely by how full the GPU is kept. Idle plus "clocks up" activity power is a floor of 34–45% of energy even at high load.</w:t>
       </w:r>
     </w:p>
     <w:p>
@@ -4336,7 +4655,7 @@
         <w:rPr>
           <w:i w:val="0"/>
         </w:rPr>
-        <w:t>So energy per token falls as 1/throughput: A100 2.04 J at 1 req/s vs 0.086 J at 24 req/s.</w:t>
+        <w:t>For provisioning, consolidating traffic onto fewer, fuller GPUs is the main energy lever, on every GPU type.</w:t>
       </w:r>
     </w:p>
     <w:p>
@@ -4347,18 +4666,25 @@
         <w:rPr>
           <w:i w:val="0"/>
         </w:rPr>
-        <w:t>An under-loaded capped GPU is very inefficient. For capped parts, consolidating traffic onto fewer GPUs is the main energy lever.</w:t>
+        <w:t>Latency stays well inside a 50 ms per-token target in all of these runs (B200 first-token p99 ≈ 10 ms at 64 req/s; A100 TPOT p50 11–16 ms).</w:t>
       </w:r>
     </w:p>
     <w:p>
       <w:pPr>
-        <w:pStyle w:val="ListBullet2"/>
+        <w:pStyle w:val="ListBullet"/>
       </w:pPr>
+      <w:r>
+        <w:rPr>
+          <w:b/>
+          <w:i w:val="0"/>
+        </w:rPr>
+        <w:t>KV energy independently confirmed on B200.</w:t>
+      </w:r>
       <w:r>
         <w:rPr>
           <w:i w:val="0"/>
         </w:rPr>
-        <w:t>Latency stays inside a 50 ms per-token target throughout (A100 TPOT p50 11–16 ms).</w:t>
+        <w:t xml:space="preserve"> Long-output runs (short prompts, KV growing during generation, so no hidden prefill steps) give 1.58×10⁻¹⁰ J/B, or 1.26× a weight byte. That's the same as the long-context method (1.2–1.3×).</w:t>
       </w:r>
     </w:p>
     <w:p>

</xml_diff>